<commit_message>
Add resumable ImageNet-R evidence and corrected FeNeC transfer baselines
</commit_message>
<xml_diff>
--- a/paper/kbs/Highlights.docx
+++ b/paper/kbs/Highlights.docx
@@ -40,6 +40,14 @@
       </w:pPr>
       <w:r>
         <w:t>Retained columns add 2.18 points over recalibrated removal across five CIFAR steps.</w:t>
+      </w:r>
+    </w:p>
+    <w:p>
+      <w:pPr>
+        <w:pStyle w:val="ListBullet"/>
+      </w:pPr>
+      <w:r>
+        <w:t>On ImageNet-R, retained columns add 2.22 points in average incremental accuracy.</w:t>
       </w:r>
     </w:p>
     <w:sectPr>

</xml_diff>

<commit_message>
Add dense cache comparisons and shot calibration robustness evidence
</commit_message>
<xml_diff>
--- a/paper/kbs/Highlights.docx
+++ b/paper/kbs/Highlights.docx
@@ -39,7 +39,7 @@
         <w:pStyle w:val="ListBullet"/>
       </w:pPr>
       <w:r>
-        <w:t>Retained columns add 2.18 points over recalibrated removal across five CIFAR steps.</w:t>
+        <w:t>ImageNet-R novel accuracy is 84.48% versus 81.58% for a dense semantic cache.</w:t>
       </w:r>
     </w:p>
     <w:p>
@@ -47,7 +47,7 @@
         <w:pStyle w:val="ListBullet"/>
       </w:pPr>
       <w:r>
-        <w:t>On ImageNet-R, retained columns add 2.22 points in average incremental accuracy.</w:t>
+        <w:t>Repeated calibration retains a 2.14-point ImageNet-R gain over classifier removal.</w:t>
       </w:r>
     </w:p>
     <w:sectPr>

</xml_diff>

<commit_message>
Expand to ten class partitions and two CLIP encoders with paired uncertainty
</commit_message>
<xml_diff>
--- a/paper/kbs/Highlights.docx
+++ b/paper/kbs/Highlights.docx
@@ -31,7 +31,7 @@
         <w:pStyle w:val="ListBullet"/>
       </w:pPr>
       <w:r>
-        <w:t>CIFAR novel accuracy is 75.79% at a matched base accuracy of 83.48%.</w:t>
+        <w:t>Two CLIP encoders and ten class partitions test retained classifier value.</w:t>
       </w:r>
     </w:p>
     <w:p>
@@ -39,7 +39,7 @@
         <w:pStyle w:val="ListBullet"/>
       </w:pPr>
       <w:r>
-        <w:t>ImageNet-R novel accuracy is 84.48% versus 81.58% for a dense semantic cache.</w:t>
+        <w:t>ImageNet-R gains over dense prototypes are 0.71 points on L/14 and 0.90 on B/32.</w:t>
       </w:r>
     </w:p>
     <w:p>
@@ -47,7 +47,7 @@
         <w:pStyle w:val="ListBullet"/>
       </w:pPr>
       <w:r>
-        <w:t>Repeated calibration retains a 2.14-point ImageNet-R gain over classifier removal.</w:t>
+        <w:t>Validation policies report feasibility and achieved test retention separately.</w:t>
       </w:r>
     </w:p>
     <w:sectPr>

</xml_diff>

<commit_message>
Condense manuscript around retained discrimination and expansion capacity
</commit_message>
<xml_diff>
--- a/paper/kbs/Highlights.docx
+++ b/paper/kbs/Highlights.docx
@@ -15,7 +15,7 @@
         <w:pStyle w:val="ListBullet"/>
       </w:pPr>
       <w:r>
-        <w:t>Novel recognition is measured under a common original-class accuracy constraint.</w:t>
+        <w:t>Retained discrimination supplies capacity for protected class expansion.</w:t>
       </w:r>
     </w:p>
     <w:p>
@@ -23,7 +23,7 @@
         <w:pStyle w:val="ListBullet"/>
       </w:pPr>
       <w:r>
-        <w:t>Reference-anchored tables reuse trained classifiers during class expansion.</w:t>
+        <w:t>Fixed references separate existing discrimination from novel admission.</w:t>
       </w:r>
     </w:p>
     <w:p>
@@ -31,7 +31,7 @@
         <w:pStyle w:val="ListBullet"/>
       </w:pPr>
       <w:r>
-        <w:t>Two CLIP encoders and ten class partitions test retained classifier value.</w:t>
+        <w:t>Classifier value is measured at matched retention and across repeated arrivals.</w:t>
       </w:r>
     </w:p>
     <w:p>
@@ -39,7 +39,7 @@
         <w:pStyle w:val="ListBullet"/>
       </w:pPr>
       <w:r>
-        <w:t>ImageNet-R gains over dense prototypes are 0.71 points on L/14 and 0.90 on B/32.</w:t>
+        <w:t>ImageNet-R gains over dense prototypes persist with two frozen CLIP encoders.</w:t>
       </w:r>
     </w:p>
     <w:p>
@@ -47,7 +47,7 @@
         <w:pStyle w:val="ListBullet"/>
       </w:pPr>
       <w:r>
-        <w:t>Independent risk calibration enables certified expansion on ImageNet-R.</w:t>
+        <w:t>Independent calibration supports useful expansion on ImageNet-R.</w:t>
       </w:r>
     </w:p>
     <w:sectPr>

</xml_diff>

<commit_message>
Validate independently retuned fusion and frozen-source Sketch admission
</commit_message>
<xml_diff>
--- a/paper/kbs/Highlights.docx
+++ b/paper/kbs/Highlights.docx
@@ -15,7 +15,7 @@
         <w:pStyle w:val="ListBullet"/>
       </w:pPr>
       <w:r>
-        <w:t>Retained discrimination supplies capacity for protected class expansion.</w:t>
+        <w:t>Frozen classifiers support expansion under a shared retention requirement.</w:t>
       </w:r>
     </w:p>
     <w:p>
@@ -23,7 +23,7 @@
         <w:pStyle w:val="ListBullet"/>
       </w:pPr>
       <w:r>
-        <w:t>Fixed references separate existing discrimination from novel admission.</w:t>
+        <w:t>Query normalization improves ImageNet-R capacity after equal-budget tuning.</w:t>
       </w:r>
     </w:p>
     <w:p>
@@ -39,7 +39,7 @@
         <w:pStyle w:val="ListBullet"/>
       </w:pPr>
       <w:r>
-        <w:t>ImageNet-R incremental gains persist across two frozen CLIP encoders.</w:t>
+        <w:t>Frozen source models enable useful admission on deduplicated Sketch images.</w:t>
       </w:r>
     </w:p>
     <w:p>

</xml_diff>

<commit_message>
Reframe class expansion around evidence alignment and risk certification
</commit_message>
<xml_diff>
--- a/paper/kbs/Highlights.docx
+++ b/paper/kbs/Highlights.docx
@@ -15,7 +15,7 @@
         <w:pStyle w:val="ListBullet"/>
       </w:pPr>
       <w:r>
-        <w:t>Frozen classifiers support expansion under a shared retention requirement.</w:t>
+        <w:t>Fixed reference banks preserve existing scores as the class vocabulary grows.</w:t>
       </w:r>
     </w:p>
     <w:p>
@@ -23,7 +23,7 @@
         <w:pStyle w:val="ListBullet"/>
       </w:pPr>
       <w:r>
-        <w:t>Query normalization improves ImageNet-R capacity after equal-budget tuning.</w:t>
+        <w:t>Query normalization induces an explicit adaptive admission margin.</w:t>
       </w:r>
     </w:p>
     <w:p>
@@ -31,7 +31,7 @@
         <w:pStyle w:val="ListBullet"/>
       </w:pPr>
       <w:r>
-        <w:t>Classifier value is measured at matched retention and across repeated arrivals.</w:t>
+        <w:t>Preserved base rankings make protection equivalent to the retention target.</w:t>
       </w:r>
     </w:p>
     <w:p>
@@ -39,7 +39,7 @@
         <w:pStyle w:val="ListBullet"/>
       </w:pPr>
       <w:r>
-        <w:t>Frozen source models enable useful admission on deduplicated Sketch images.</w:t>
+        <w:t>Recovery-aware testing certifies admission under a shared accuracy requirement.</w:t>
       </w:r>
     </w:p>
     <w:p>
@@ -47,7 +47,7 @@
         <w:pStyle w:val="ListBullet"/>
       </w:pPr>
       <w:r>
-        <w:t>Recovery-aware calibration separates admission from recognition gains.</w:t>
+        <w:t>Target calibration transfers frozen source readouts to ImageNet-Sketch.</w:t>
       </w:r>
     </w:p>
     <w:sectPr>

</xml_diff>

<commit_message>
Reframe manuscript around asymmetric evidence alignment
</commit_message>
<xml_diff>
--- a/paper/kbs/Highlights.docx
+++ b/paper/kbs/Highlights.docx
@@ -15,7 +15,7 @@
         <w:pStyle w:val="ListBullet"/>
       </w:pPr>
       <w:r>
-        <w:t>Fixed reference banks preserve existing scores as the class vocabulary grows.</w:t>
+        <w:t>Fixed base references align asymmetric evidence without vocabulary-induced drift.</w:t>
       </w:r>
     </w:p>
     <w:p>
@@ -23,7 +23,7 @@
         <w:pStyle w:val="ListBullet"/>
       </w:pPr>
       <w:r>
-        <w:t>Query normalization induces an explicit adaptive admission margin.</w:t>
+        <w:t>Query-adaptive margins improve base--novel recognition without extra routers.</w:t>
       </w:r>
     </w:p>
     <w:p>
@@ -31,7 +31,7 @@
         <w:pStyle w:val="ListBullet"/>
       </w:pPr>
       <w:r>
-        <w:t>Preserved base rankings make protection equivalent to the retention target.</w:t>
+        <w:t>Matched HyCal gains reach 10.93 and 13.74 points on ImageNet-R.</w:t>
       </w:r>
     </w:p>
     <w:p>
@@ -39,7 +39,7 @@
         <w:pStyle w:val="ListBullet"/>
       </w:pPr>
       <w:r>
-        <w:t>Recovery-aware testing certifies admission under a shared accuracy requirement.</w:t>
+        <w:t>Independent calibration selects admission under a base-accuracy requirement.</w:t>
       </w:r>
     </w:p>
     <w:p>
@@ -47,7 +47,7 @@
         <w:pStyle w:val="ListBullet"/>
       </w:pPr>
       <w:r>
-        <w:t>Target calibration transfers frozen source readouts to ImageNet-Sketch.</w:t>
+        <w:t>Target calibration transfers frozen classifiers and prototypes to new renditions.</w:t>
       </w:r>
     </w:p>
     <w:sectPr>

</xml_diff>